<commit_message>
Improve detection robustness and add object experiment
</commit_message>
<xml_diff>
--- a/output/report/CSCI435_Project_Report.docx
+++ b/output/report/CSCI435_Project_Report.docx
@@ -189,7 +189,7 @@
         <w:t xml:space="preserve">Key outcome. </w:t>
       </w:r>
       <w:r>
-        <w:t>The executed notebook measured 92.5% mean precision, 88.1% recall and 89.8% F1 across seven scene conditions. The full still-frame pipeline averaged 74.2 FPS (13.5 ms), exceeding the 10 FPS requirement.</w:t>
+        <w:t>The executed notebook measured 93.0% mean precision, 94.6% recall and 93.1% F1 across seven scene conditions. The full still-frame pipeline averaged 50.1 FPS (20.0 ms), exceeding the 10 FPS requirement.</w:t>
       </w:r>
     </w:p>
     <w:p>
@@ -544,7 +544,7 @@
     </w:p>
     <w:p>
       <w:r>
-        <w:t>HSV thresholds form red, yellow and green proposal masks. Opening removes isolated pixels and closing joins small gaps. Contours below 300 pixels or outside broad aspect-ratio limits are rejected. Each remaining object is centred on a neutral 96 x 96 canvas at a fixed foreground scale. This canonicalisation solved an important training/inference mismatch: the recogniser now sees the same object scale during both phases. Proposal masks come from the enhanced frame, while recognition uses pre-enhancement validated pixels to preserve the training appearance distribution.</w:t>
+        <w:t>HSV thresholds form red, yellow and green proposal masks. Opening removes isolated pixels and closing joins small gaps. Original and enhanced pixels are both searched using separate colour masks so a dominant single colour cannot be lost during balancing and adjacent marker colours cannot merge. Contours below 300 pixels or outside broad aspect-ratio limits are rejected. Each remaining object is centred on a neutral 96 x 96 canvas at a fixed foreground scale. This canonicalisation solved an important training/inference mismatch: the recogniser now sees the same object scale during both phases. Proposal masks are classified by the SVM using pre-enhancement validated pixels to preserve the training appearance distribution. When the synthetic crop model is uncertain, a conservative fusion rule checks canonical evidence: red octagonal regions with a bright symbol support stop, yellow triangular regions support warning, and green circular regions with a bright internal symbol support safe. This recovered real-style examples without replacing the learned model.</w:t>
       </w:r>
     </w:p>
     <w:p>
@@ -943,7 +943,7 @@
                 <w:b w:val="0"/>
                 <w:sz w:val="17"/>
               </w:rPr>
-              <w:t>0.100</w:t>
+              <w:t>0.105</w:t>
             </w:r>
           </w:p>
         </w:tc>
@@ -969,7 +969,7 @@
                 <w:b w:val="0"/>
                 <w:sz w:val="17"/>
               </w:rPr>
-              <w:t>0.078</w:t>
+              <w:t>0.070</w:t>
             </w:r>
           </w:p>
         </w:tc>
@@ -1052,7 +1052,7 @@
                 <w:b w:val="0"/>
                 <w:sz w:val="17"/>
               </w:rPr>
-              <w:t>0.188</w:t>
+              <w:t>0.168</w:t>
             </w:r>
           </w:p>
         </w:tc>
@@ -1078,7 +1078,7 @@
                 <w:b w:val="0"/>
                 <w:sz w:val="17"/>
               </w:rPr>
-              <w:t>0.168</w:t>
+              <w:t>0.193</w:t>
             </w:r>
           </w:p>
         </w:tc>
@@ -1161,7 +1161,7 @@
                 <w:b w:val="0"/>
                 <w:sz w:val="17"/>
               </w:rPr>
-              <w:t>0.004</w:t>
+              <w:t>0.005</w:t>
             </w:r>
           </w:p>
         </w:tc>
@@ -1187,7 +1187,7 @@
                 <w:b w:val="0"/>
                 <w:sz w:val="17"/>
               </w:rPr>
-              <w:t>0.363</w:t>
+              <w:t>9.172</w:t>
             </w:r>
           </w:p>
         </w:tc>
@@ -1573,7 +1573,7 @@
                 <w:b w:val="0"/>
                 <w:sz w:val="16"/>
               </w:rPr>
-              <w:t>95.8%</w:t>
+              <w:t>100.0%</w:t>
             </w:r>
           </w:p>
         </w:tc>
@@ -1599,7 +1599,7 @@
                 <w:b w:val="0"/>
                 <w:sz w:val="16"/>
               </w:rPr>
-              <w:t>97.9%</w:t>
+              <w:t>100.0%</w:t>
             </w:r>
           </w:p>
         </w:tc>
@@ -1625,7 +1625,7 @@
                 <w:b w:val="0"/>
                 <w:sz w:val="16"/>
               </w:rPr>
-              <w:t>0.762</w:t>
+              <w:t>0.765</w:t>
             </w:r>
           </w:p>
         </w:tc>
@@ -1708,7 +1708,7 @@
                 <w:b w:val="0"/>
                 <w:sz w:val="16"/>
               </w:rPr>
-              <w:t>95.2%</w:t>
+              <w:t>95.5%</w:t>
             </w:r>
           </w:p>
         </w:tc>
@@ -1734,7 +1734,7 @@
                 <w:b w:val="0"/>
                 <w:sz w:val="16"/>
               </w:rPr>
-              <w:t>83.3%</w:t>
+              <w:t>87.5%</w:t>
             </w:r>
           </w:p>
         </w:tc>
@@ -1760,7 +1760,7 @@
                 <w:b w:val="0"/>
                 <w:sz w:val="16"/>
               </w:rPr>
-              <w:t>88.9%</w:t>
+              <w:t>91.3%</w:t>
             </w:r>
           </w:p>
         </w:tc>
@@ -1786,7 +1786,7 @@
                 <w:b w:val="0"/>
                 <w:sz w:val="16"/>
               </w:rPr>
-              <w:t>0.725</w:t>
+              <w:t>0.727</w:t>
             </w:r>
           </w:p>
         </w:tc>
@@ -1869,7 +1869,7 @@
                 <w:b w:val="0"/>
                 <w:sz w:val="16"/>
               </w:rPr>
-              <w:t>90.0%</w:t>
+              <w:t>100.0%</w:t>
             </w:r>
           </w:p>
         </w:tc>
@@ -1895,7 +1895,7 @@
                 <w:b w:val="0"/>
                 <w:sz w:val="16"/>
               </w:rPr>
-              <w:t>75.0%</w:t>
+              <w:t>100.0%</w:t>
             </w:r>
           </w:p>
         </w:tc>
@@ -1921,7 +1921,7 @@
                 <w:b w:val="0"/>
                 <w:sz w:val="16"/>
               </w:rPr>
-              <w:t>81.8%</w:t>
+              <w:t>100.0%</w:t>
             </w:r>
           </w:p>
         </w:tc>
@@ -1947,7 +1947,7 @@
                 <w:b w:val="0"/>
                 <w:sz w:val="16"/>
               </w:rPr>
-              <w:t>0.774</w:t>
+              <w:t>0.770</w:t>
             </w:r>
           </w:p>
         </w:tc>
@@ -2108,7 +2108,7 @@
                 <w:b w:val="0"/>
                 <w:sz w:val="16"/>
               </w:rPr>
-              <w:t>0.795</w:t>
+              <w:t>0.803</w:t>
             </w:r>
           </w:p>
         </w:tc>
@@ -2269,7 +2269,7 @@
                 <w:b w:val="0"/>
                 <w:sz w:val="16"/>
               </w:rPr>
-              <w:t>0.757</w:t>
+              <w:t>0.752</w:t>
             </w:r>
           </w:p>
         </w:tc>
@@ -2352,7 +2352,7 @@
                 <w:b w:val="0"/>
                 <w:sz w:val="16"/>
               </w:rPr>
-              <w:t>94.7%</w:t>
+              <w:t>95.0%</w:t>
             </w:r>
           </w:p>
         </w:tc>
@@ -2378,7 +2378,7 @@
                 <w:b w:val="0"/>
                 <w:sz w:val="16"/>
               </w:rPr>
-              <w:t>75.0%</w:t>
+              <w:t>79.2%</w:t>
             </w:r>
           </w:p>
         </w:tc>
@@ -2404,7 +2404,7 @@
                 <w:b w:val="0"/>
                 <w:sz w:val="16"/>
               </w:rPr>
-              <w:t>83.7%</w:t>
+              <w:t>86.4%</w:t>
             </w:r>
           </w:p>
         </w:tc>
@@ -2430,7 +2430,7 @@
                 <w:b w:val="0"/>
                 <w:sz w:val="16"/>
               </w:rPr>
-              <w:t>0.714</w:t>
+              <w:t>0.724</w:t>
             </w:r>
           </w:p>
         </w:tc>
@@ -2513,7 +2513,7 @@
                 <w:b w:val="0"/>
                 <w:sz w:val="16"/>
               </w:rPr>
-              <w:t>67.7%</w:t>
+              <w:t>60.5%</w:t>
             </w:r>
           </w:p>
         </w:tc>
@@ -2539,7 +2539,7 @@
                 <w:b w:val="0"/>
                 <w:sz w:val="16"/>
               </w:rPr>
-              <w:t>87.5%</w:t>
+              <w:t>95.8%</w:t>
             </w:r>
           </w:p>
         </w:tc>
@@ -2565,7 +2565,7 @@
                 <w:b w:val="0"/>
                 <w:sz w:val="16"/>
               </w:rPr>
-              <w:t>76.4%</w:t>
+              <w:t>74.2%</w:t>
             </w:r>
           </w:p>
         </w:tc>
@@ -2591,7 +2591,7 @@
                 <w:b w:val="0"/>
                 <w:sz w:val="16"/>
               </w:rPr>
-              <w:t>0.745</w:t>
+              <w:t>0.750</w:t>
             </w:r>
           </w:p>
         </w:tc>
@@ -2635,7 +2635,7 @@
     </w:p>
     <w:p>
       <w:r>
-        <w:t>Across the seven conditions, mean precision was 92.5%, mean recall was 88.1% and mean F1 was 89.8%. Blurred and noisy generated scenes reached perfect detection scores in this run. Rotated, occluded and cluttered scenes were harder. Clutter reduced precision because saturated distractors sometimes survived proposal filtering; rotated and occluded targets mainly reduced recall. This pattern is consistent with the proposal/classification design.</w:t>
+        <w:t>Across the seven conditions, mean precision was 93.0%, mean recall was 94.6% and mean F1 was 93.1%. Blurred and noisy generated scenes reached perfect detection scores in this run. Rotated, occluded and cluttered scenes were harder. Clutter reduced precision because saturated distractors sometimes survived proposal filtering; rotated and occluded targets mainly reduced recall. This pattern is consistent with the proposal/classification design.</w:t>
       </w:r>
     </w:p>
     <w:p>
@@ -2821,7 +2821,7 @@
                 <w:b w:val="0"/>
                 <w:sz w:val="18"/>
               </w:rPr>
-              <w:t>13.47 ms</w:t>
+              <w:t>19.96 ms</w:t>
             </w:r>
           </w:p>
         </w:tc>
@@ -2878,7 +2878,7 @@
                 <w:b w:val="0"/>
                 <w:sz w:val="18"/>
               </w:rPr>
-              <w:t>13.57 ms</w:t>
+              <w:t>19.70 ms</w:t>
             </w:r>
           </w:p>
         </w:tc>
@@ -2935,7 +2935,7 @@
                 <w:b w:val="0"/>
                 <w:sz w:val="18"/>
               </w:rPr>
-              <w:t>15.08 ms</w:t>
+              <w:t>21.74 ms</w:t>
             </w:r>
           </w:p>
         </w:tc>
@@ -2992,7 +2992,7 @@
                 <w:b w:val="0"/>
                 <w:sz w:val="18"/>
               </w:rPr>
-              <w:t>74.23 FPS</w:t>
+              <w:t>50.09 FPS</w:t>
             </w:r>
           </w:p>
         </w:tc>
@@ -3049,7 +3049,7 @@
                 <w:b w:val="0"/>
                 <w:sz w:val="18"/>
               </w:rPr>
-              <w:t>13.27 ms/frame</w:t>
+              <w:t>16.75 ms/frame</w:t>
             </w:r>
           </w:p>
         </w:tc>
@@ -3106,7 +3106,7 @@
                 <w:b w:val="0"/>
                 <w:sz w:val="18"/>
               </w:rPr>
-              <w:t>75.36 FPS</w:t>
+              <w:t>59.72 FPS</w:t>
             </w:r>
           </w:p>
         </w:tc>
@@ -3201,7 +3201,7 @@
       <w:r>
         <w:drawing>
           <wp:inline xmlns:a="http://schemas.openxmlformats.org/drawingml/2006/main" xmlns:pic="http://schemas.openxmlformats.org/drawingml/2006/picture">
-            <wp:extent cx="5623560" cy="3911059"/>
+            <wp:extent cx="5623560" cy="3913025"/>
             <wp:docPr id="6" name="Picture 6" descr="Four-panel qualitative output showing the original scene, enhanced scene, Canny overlay and detected stop, warning and safe markers." title="Four-panel qualitative output showing the original scene, enhanced scene, Canny overlay and detected stop, warning and safe markers."/>
             <wp:cNvGraphicFramePr>
               <a:graphicFrameLocks noChangeAspect="1"/>
@@ -3222,7 +3222,7 @@
                   <pic:spPr>
                     <a:xfrm>
                       <a:off x="0" y="0"/>
-                      <a:ext cx="5623560" cy="3911059"/>
+                      <a:ext cx="5623560" cy="3913025"/>
                     </a:xfrm>
                     <a:prstGeom prst="rect"/>
                   </pic:spPr>
@@ -3290,6 +3290,15 @@
       </w:pPr>
       <w:r>
         <w:t>Cluttered scene: false positives are measured rather than removed from the reported results.</w:t>
+      </w:r>
+    </w:p>
+    <w:p>
+      <w:pPr>
+        <w:pStyle w:val="ListBullet"/>
+        <w:keepLines/>
+      </w:pPr>
+      <w:r>
+        <w:t>Supplied real-style regression images: stop detected at 98.0% and safe detected at 94.6%.</w:t>
       </w:r>
     </w:p>
     <w:p>
@@ -4984,7 +4993,7 @@
                 <w:b w:val="0"/>
                 <w:sz w:val="16"/>
               </w:rPr>
-              <w:t>74.2 FPS measured versus 10 FPS requirement; Table 3.</w:t>
+              <w:t>50.1 FPS measured versus 10 FPS requirement; Table 3.</w:t>
             </w:r>
           </w:p>
         </w:tc>

</xml_diff>

<commit_message>
Make processed videos browser-compatible
</commit_message>
<xml_diff>
--- a/output/report/CSCI435_Project_Report.docx
+++ b/output/report/CSCI435_Project_Report.docx
@@ -47,6 +47,10 @@
       <w:pPr>
         <w:spacing w:after="720"/>
         <w:jc w:val="center"/>
+        <w:rPr>
+          <w:color w:val="1F4D78"/>
+          <w:sz w:val="28"/>
+        </w:rPr>
       </w:pPr>
       <w:r>
         <w:rPr>
@@ -54,6 +58,26 @@
           <w:sz w:val="28"/>
         </w:rPr>
         <w:t>An Integrated Computer Vision Application for Accessible Scene Guidance</w:t>
+      </w:r>
+    </w:p>
+    <w:p>
+      <w:pPr>
+        <w:spacing w:after="720"/>
+        <w:jc w:val="center"/>
+      </w:pPr>
+      <w:r>
+        <w:rPr>
+          <w:color w:val="1F4D78"/>
+          <w:sz w:val="28"/>
+        </w:rPr>
+        <w:t xml:space="preserve">GITHUB REPO - </w:t>
+      </w:r>
+      <w:r>
+        <w:rPr>
+          <w:color w:val="1F4D78"/>
+          <w:sz w:val="28"/>
+        </w:rPr>
+        <w:t>https://github.com/NXRJ/CSIT435-Project</w:t>
       </w:r>
     </w:p>
     <w:p>
@@ -6561,6 +6585,7 @@
   <w:style w:type="character" w:default="1" w:styleId="DefaultParagraphFont">
     <w:name w:val="Default Paragraph Font"/>
     <w:uiPriority w:val="1"/>
+    <w:semiHidden/>
     <w:unhideWhenUsed/>
   </w:style>
   <w:style w:type="table" w:default="1" w:styleId="TableNormal">

</xml_diff>